<commit_message>
fix(proposal): extend tax-exempt + no-site-visit to polish/combo; cove base height
- #3/#4 now applied to the POLISH and COMBO templates too (their site-visit and
  single-bid tax lines were split across runs — used an across-runs span replacer).
  All three Direct templates now use {{site_visit_phrase}} + {{base_tax_phrase}}.
- #5 Cove base height: the WORK area line now reads "<LF> LF of <h>" epoxy cove
  base" (configurable, default 6"); new height field on Proposal Review;
  _build_epoxy_systems threads values.cove_height.

170 backend tests pass.

Co-Authored-By: Claude Opus 4.8 <noreply@anthropic.com>
</commit_message>
<xml_diff>
--- a/backend/templates/Direct/xx.xx TREADWELL POLISH PROPOSAL - NewDirect.docx
+++ b/backend/templates/Direct/xx.xx TREADWELL POLISH PROPOSAL - NewDirect.docx
@@ -887,7 +887,7 @@
                                 <w:szCs w:val="16"/>
                                 <w:u w:val="single"/>
                               </w:rPr>
-                              <w:t xml:space="preserve">Polished Concrete: per site visit on {{bid_date_formatted}}</w:t>
+                              <w:t xml:space="preserve">Polished Concrete: {{site_visit_phrase}}</w:t>
                             </w:r>
                             <w:r>
                               <w:rPr>
@@ -1280,7 +1280,7 @@
                           <w:szCs w:val="16"/>
                           <w:u w:val="single"/>
                         </w:rPr>
-                        <w:t xml:space="preserve">Polished Concrete: per site visit on {{bid_date_formatted}}</w:t>
+                        <w:t xml:space="preserve">Polished Concrete: {{site_visit_phrase}}</w:t>
                       </w:r>
                       <w:r>
                         <w:rPr>
@@ -1744,7 +1744,7 @@
                                 <w:sz w:val="18"/>
                                 <w:szCs w:val="18"/>
                               </w:rPr>
-                              <w:t xml:space="preserve">{{base_bid_formatted}} – Polished Concrete Flooring as described above (material sales tax INCLUDED)</w:t>
+                              <w:t xml:space="preserve">{{base_bid_formatted}} – Polished Concrete Flooring as described above {{base_tax_phrase}}</w:t>
                             </w:r>
                           </w:p>
                           <w:p>
@@ -2005,7 +2005,7 @@
                                 <w:sz w:val="18"/>
                                 <w:szCs w:val="18"/>
                               </w:rPr>
-                              <w:t xml:space="preserve">{{alternate.lump_sum_formatted}} – Flooring as described above (material sales tax INCLUDED)</w:t>
+                              <w:t xml:space="preserve">{{alternate.lump_sum_formatted}} – Flooring as described above {{base_tax_phrase}}</w:t>
                             </w:r>
                           </w:p>
                           <w:p>
@@ -2263,7 +2263,7 @@
                           <w:sz w:val="18"/>
                           <w:szCs w:val="18"/>
                         </w:rPr>
-                        <w:t xml:space="preserve">{{base_bid_formatted}} – Polished Concrete Flooring as described above (material sales tax INCLUDED)</w:t>
+                        <w:t xml:space="preserve">{{base_bid_formatted}} – Polished Concrete Flooring as described above {{base_tax_phrase}}</w:t>
                       </w:r>
                     </w:p>
                     <w:p>
@@ -2524,7 +2524,7 @@
                           <w:sz w:val="18"/>
                           <w:szCs w:val="18"/>
                         </w:rPr>
-                        <w:t xml:space="preserve">{{alternate.lump_sum_formatted}} – Flooring as described above (material sales tax INCLUDED)</w:t>
+                        <w:t xml:space="preserve">{{alternate.lump_sum_formatted}} – Flooring as described above {{base_tax_phrase}}</w:t>
                       </w:r>
                     </w:p>
                     <w:p>

</xml_diff>

<commit_message>
fix: polish proposal — 'Options' heading renders above the option lines
Kyle's Polish Direct template authored the {{#has_options}} "Options"
heading at the BOTTOM of the price block (after the {{#price_line}} rows
and {{#alternate}}), so a "Polish Add Dye" option printed with no heading
above it. Moved the 3-paragraph has_options block to render BEFORE
{{#price_line}} in both text-box copies (mc:Choice + mc:Fallback), matching
the Epoxy/Combo layout.

- backend/templates/Direct/…POLISH…NewDirect.docx: block relocated.
- test_price_formatting.py: order test (joined-text assertion, since the
  block renders both as separate paragraphs and as one <w:br>-broken
  text-box paragraph); verified it fails on the pre-move template.
- test_gc_narrative.py: re-pin the polish template SHA256 (intentional edit).

Co-Authored-By: Claude Opus 4.8 (1M context) <noreply@anthropic.com>
</commit_message>
<xml_diff>
--- a/backend/templates/Direct/xx.xx TREADWELL POLISH PROPOSAL - NewDirect.docx
+++ b/backend/templates/Direct/xx.xx TREADWELL POLISH PROPOSAL - NewDirect.docx
@@ -1880,6 +1880,40 @@
                             </w:r>
                           </w:p>
                           <w:p>
+                            <w:r>
+                              <w:t xml:space="preserve">{{#has_options}}</w:t>
+                            </w:r>
+                          </w:p>
+                          <w:p>
+                            <w:pPr>
+                              <w:spacing w:line="300" w:lineRule="auto"/>
+                              <w:rPr>
+                                <w:rFonts w:ascii="Zetta Serif Book" w:hAnsi="Zetta Serif Book"/>
+                                <w:b/>
+                                <w:color w:val="404040" w:themeColor="text1" w:themeTint="BF"/>
+                                <w:sz w:val="18"/>
+                                <w:szCs w:val="18"/>
+                                <w:u w:val="single"/>
+                              </w:rPr>
+                            </w:pPr>
+                            <w:r>
+                              <w:rPr>
+                                <w:rFonts w:ascii="Zetta Serif Book" w:hAnsi="Zetta Serif Book"/>
+                                <w:b/>
+                                <w:color w:val="404040" w:themeColor="text1" w:themeTint="BF"/>
+                                <w:sz w:val="18"/>
+                                <w:szCs w:val="18"/>
+                                <w:u w:val="single"/>
+                              </w:rPr>
+                              <w:t xml:space="preserve">Options </w:t>
+                            </w:r>
+                          </w:p>
+                          <w:p>
+                            <w:r>
+                              <w:t xml:space="preserve">{{/has_options}}</w:t>
+                            </w:r>
+                          </w:p>
+                          <w:p>
                             <w:pPr>
                               <w:pStyle w:val="ListParagraph"/>
                               <w:numPr>
@@ -2137,40 +2171,6 @@
                                 <w:szCs w:val="10"/>
                               </w:rPr>
                             </w:pPr>
-                          </w:p>
-                          <w:p>
-                            <w:r>
-                              <w:t xml:space="preserve">{{#has_options}}</w:t>
-                            </w:r>
-                          </w:p>
-                          <w:p>
-                            <w:pPr>
-                              <w:spacing w:line="300" w:lineRule="auto"/>
-                              <w:rPr>
-                                <w:rFonts w:ascii="Zetta Serif Book" w:hAnsi="Zetta Serif Book"/>
-                                <w:b/>
-                                <w:color w:val="404040" w:themeColor="text1" w:themeTint="BF"/>
-                                <w:sz w:val="18"/>
-                                <w:szCs w:val="18"/>
-                                <w:u w:val="single"/>
-                              </w:rPr>
-                            </w:pPr>
-                            <w:r>
-                              <w:rPr>
-                                <w:rFonts w:ascii="Zetta Serif Book" w:hAnsi="Zetta Serif Book"/>
-                                <w:b/>
-                                <w:color w:val="404040" w:themeColor="text1" w:themeTint="BF"/>
-                                <w:sz w:val="18"/>
-                                <w:szCs w:val="18"/>
-                                <w:u w:val="single"/>
-                              </w:rPr>
-                              <w:t xml:space="preserve">Options </w:t>
-                            </w:r>
-                          </w:p>
-                          <w:p>
-                            <w:r>
-                              <w:t xml:space="preserve">{{/has_options}}</w:t>
-                            </w:r>
                           </w:p>
                           <w:p>
                             <w:pPr>
@@ -2442,6 +2442,40 @@
                       </w:r>
                     </w:p>
                     <w:p>
+                      <w:r>
+                        <w:t xml:space="preserve">{{#has_options}}</w:t>
+                      </w:r>
+                    </w:p>
+                    <w:p>
+                      <w:pPr>
+                        <w:spacing w:line="300" w:lineRule="auto"/>
+                        <w:rPr>
+                          <w:rFonts w:ascii="Zetta Serif Book" w:hAnsi="Zetta Serif Book"/>
+                          <w:b/>
+                          <w:color w:val="404040" w:themeColor="text1" w:themeTint="BF"/>
+                          <w:sz w:val="18"/>
+                          <w:szCs w:val="18"/>
+                          <w:u w:val="single"/>
+                        </w:rPr>
+                      </w:pPr>
+                      <w:r>
+                        <w:rPr>
+                          <w:rFonts w:ascii="Zetta Serif Book" w:hAnsi="Zetta Serif Book"/>
+                          <w:b/>
+                          <w:color w:val="404040" w:themeColor="text1" w:themeTint="BF"/>
+                          <w:sz w:val="18"/>
+                          <w:szCs w:val="18"/>
+                          <w:u w:val="single"/>
+                        </w:rPr>
+                        <w:t xml:space="preserve">Options </w:t>
+                      </w:r>
+                    </w:p>
+                    <w:p>
+                      <w:r>
+                        <w:t xml:space="preserve">{{/has_options}}</w:t>
+                      </w:r>
+                    </w:p>
+                    <w:p>
                       <w:pPr>
                         <w:pStyle w:val="ListParagraph"/>
                         <w:numPr>
@@ -2699,40 +2733,6 @@
                           <w:szCs w:val="10"/>
                         </w:rPr>
                       </w:pPr>
-                    </w:p>
-                    <w:p>
-                      <w:r>
-                        <w:t xml:space="preserve">{{#has_options}}</w:t>
-                      </w:r>
-                    </w:p>
-                    <w:p>
-                      <w:pPr>
-                        <w:spacing w:line="300" w:lineRule="auto"/>
-                        <w:rPr>
-                          <w:rFonts w:ascii="Zetta Serif Book" w:hAnsi="Zetta Serif Book"/>
-                          <w:b/>
-                          <w:color w:val="404040" w:themeColor="text1" w:themeTint="BF"/>
-                          <w:sz w:val="18"/>
-                          <w:szCs w:val="18"/>
-                          <w:u w:val="single"/>
-                        </w:rPr>
-                      </w:pPr>
-                      <w:r>
-                        <w:rPr>
-                          <w:rFonts w:ascii="Zetta Serif Book" w:hAnsi="Zetta Serif Book"/>
-                          <w:b/>
-                          <w:color w:val="404040" w:themeColor="text1" w:themeTint="BF"/>
-                          <w:sz w:val="18"/>
-                          <w:szCs w:val="18"/>
-                          <w:u w:val="single"/>
-                        </w:rPr>
-                        <w:t xml:space="preserve">Options </w:t>
-                      </w:r>
-                    </w:p>
-                    <w:p>
-                      <w:r>
-                        <w:t xml:space="preserve">{{/has_options}}</w:t>
-                      </w:r>
                     </w:p>
                     <w:p>
                       <w:pPr>

</xml_diff>